<commit_message>
Update coursework report with precise goal formulation
- Add detailed goal: 'автоматизация сбора и анализа ЭЭГ при помощи набора алгоритмов, демонстрирующих применение знаний в области программной инженерии для решения задач построения нейроинтерфейсов и биоинженерии'
- Update conclusion to reflect software engineering principles application
- Add mentions of neurointerfaces and bioengineering in future prospects
- Update architecture section with software engineering principles
- Rebuild DOCX version with all updates
</commit_message>
<xml_diff>
--- a/EEG_Analysis_Coursework_Report.docx
+++ b/EEG_Analysis_Coursework_Report.docx
@@ -376,6 +376,24 @@
           <w:bCs/>
         </w:rPr>
         <w:t xml:space="preserve">Основная цель:</w:t>
+      </w:r>
+      <w:r>
+        <w:t xml:space="preserve"> </w:t>
+      </w:r>
+      <w:r>
+        <w:t xml:space="preserve">Автоматизация сбора и анализа ЭЭГ при помощи набора алгоритмов, демонстрирующих применение знаний в области программной инженерии для решения задач построения нейроинтерфейсов и биоинженерии.</w:t>
+      </w:r>
+    </w:p>
+    <w:p>
+      <w:pPr>
+        <w:pStyle w:val="BodyText"/>
+      </w:pPr>
+      <w:r>
+        <w:rPr>
+          <w:b/>
+          <w:bCs/>
+        </w:rPr>
+        <w:t xml:space="preserve">Конкретная цель разработки:</w:t>
       </w:r>
       <w:r>
         <w:t xml:space="preserve"> </w:t>
@@ -2280,6 +2298,14 @@
         <w:t xml:space="preserve">3.2. Проектирование архитектуры модуля</w:t>
       </w:r>
     </w:p>
+    <w:p>
+      <w:pPr>
+        <w:pStyle w:val="FirstParagraph"/>
+      </w:pPr>
+      <w:r>
+        <w:t xml:space="preserve">Архитектура программного модуля разработана с учетом принципов программной инженерии: модульность, разделение ответственности, слабая связность компонентов и высокая связность внутри модулей.</w:t>
+      </w:r>
+    </w:p>
     <w:bookmarkStart w:id="45" w:name="основные-компоненты-системы"/>
     <w:p>
       <w:pPr>
@@ -3804,7 +3830,15 @@
         <w:pStyle w:val="FirstParagraph"/>
       </w:pPr>
       <w:r>
-        <w:t xml:space="preserve">В рамках курсовой работы был успешно разработан программный модуль для анализа ЭЭГ-сигналов с полным спектром функциональности. Основные достижения:</w:t>
+        <w:t xml:space="preserve">В рамках курсовой работы была успешно реализована цель автоматизации сбора и анализа ЭЭГ-сигналов при помощи набора алгоритмов, демонстрирующих применение знаний в области программной инженерии для решения задач построения нейроинтерфейсов и биоинженерии.</w:t>
+      </w:r>
+    </w:p>
+    <w:p>
+      <w:pPr>
+        <w:pStyle w:val="BodyText"/>
+      </w:pPr>
+      <w:r>
+        <w:t xml:space="preserve">Основные достижения разработки программного модуля для анализа ЭЭГ-сигналов:</w:t>
       </w:r>
     </w:p>
     <w:bookmarkStart w:id="57" w:name="реализованные-компоненты"/>
@@ -3941,6 +3975,25 @@
       </w:r>
       <w:r>
         <w:t xml:space="preserve">: Итеративный дизайн с учетом обратной связи</w:t>
+      </w:r>
+    </w:p>
+    <w:p>
+      <w:pPr>
+        <w:pStyle w:val="Compact"/>
+        <w:numPr>
+          <w:ilvl w:val="0"/>
+          <w:numId w:val="1025"/>
+        </w:numPr>
+      </w:pPr>
+      <w:r>
+        <w:rPr>
+          <w:b/>
+          <w:bCs/>
+        </w:rPr>
+        <w:t xml:space="preserve">Применение принципов программной инженерии</w:t>
+      </w:r>
+      <w:r>
+        <w:t xml:space="preserve">: Модульная архитектура, разделение ответственности, повторное использование кода</w:t>
       </w:r>
     </w:p>
     <w:bookmarkEnd w:id="58"/>
@@ -3959,7 +4012,15 @@
         <w:pStyle w:val="FirstParagraph"/>
       </w:pPr>
       <w:r>
-        <w:t xml:space="preserve">Разработанное приложение полностью соответствует заявленным требованиям:</w:t>
+        <w:t xml:space="preserve">Разработанный программный комплекс полностью соответствует поставленной цели автоматизации сбора и анализа ЭЭГ-сигналов. Реализованный набор алгоритмов демонстрирует применение знаний в области программной инженерии для решения задач построения нейроинтерфейсов и биоинженерии.</w:t>
+      </w:r>
+    </w:p>
+    <w:p>
+      <w:pPr>
+        <w:pStyle w:val="BodyText"/>
+      </w:pPr>
+      <w:r>
+        <w:t xml:space="preserve">Приложение полностью соответствует заявленным требованиям:</w:t>
       </w:r>
     </w:p>
     <w:tbl>
@@ -4268,7 +4329,7 @@
         <w:t xml:space="preserve">Машинное обучение</w:t>
       </w:r>
       <w:r>
-        <w:t xml:space="preserve">: Классификация состояний мозга</w:t>
+        <w:t xml:space="preserve">: Классификация состояний мозга для биоинженерии</w:t>
       </w:r>
     </w:p>
     <w:p>
@@ -4287,7 +4348,7 @@
         <w:t xml:space="preserve">Real-time анализ</w:t>
       </w:r>
       <w:r>
-        <w:t xml:space="preserve">: Обработка потоковых данных</w:t>
+        <w:t xml:space="preserve">: Обработка потоковых данных для нейроинтерфейсов</w:t>
       </w:r>
     </w:p>
     <w:p>
@@ -4306,7 +4367,7 @@
         <w:t xml:space="preserve">Мобильные приложения</w:t>
       </w:r>
       <w:r>
-        <w:t xml:space="preserve">: Анализ ЭЭГ на смартфонах</w:t>
+        <w:t xml:space="preserve">: Анализ ЭЭГ на смартфонах для телемедицины</w:t>
       </w:r>
     </w:p>
     <w:p>
@@ -4325,7 +4386,26 @@
         <w:t xml:space="preserve">Интеграция с BCI</w:t>
       </w:r>
       <w:r>
-        <w:t xml:space="preserve">: Разработка нейроинтерфейсов</w:t>
+        <w:t xml:space="preserve">: Разработка полнофункциональных нейроинтерфейсов</w:t>
+      </w:r>
+    </w:p>
+    <w:p>
+      <w:pPr>
+        <w:pStyle w:val="Compact"/>
+        <w:numPr>
+          <w:ilvl w:val="0"/>
+          <w:numId w:val="1027"/>
+        </w:numPr>
+      </w:pPr>
+      <w:r>
+        <w:rPr>
+          <w:b/>
+          <w:bCs/>
+        </w:rPr>
+        <w:t xml:space="preserve">Биоинженерия</w:t>
+      </w:r>
+      <w:r>
+        <w:t xml:space="preserve">: Применение в медицинских диагностических системах</w:t>
       </w:r>
     </w:p>
     <w:bookmarkEnd w:id="62"/>

</xml_diff>